<commit_message>
Tuất debug chạy rồi
</commit_message>
<xml_diff>
--- a/Templates/BTS/BM-15-06 TỜ TRÌNH XIN CHỦ TRƯƠNG BTS - Templates.docx
+++ b/Templates/BTS/BM-15-06 TỜ TRÌNH XIN CHỦ TRƯƠNG BTS - Templates.docx
@@ -38,21 +38,7 @@
           <w:bCs/>
           <w:szCs w:val="26"/>
         </w:rPr>
-        <w:t>{{SOTTR}}</w:t>
-      </w:r>
-      <w:r>
-        <w:rPr>
-          <w:bCs/>
-          <w:szCs w:val="26"/>
-        </w:rPr>
-        <w:t>/</w:t>
-      </w:r>
-      <w:r>
-        <w:rPr>
-          <w:bCs/>
-          <w:szCs w:val="26"/>
-        </w:rPr>
-        <w:t>TTr-SXKD</w:t>
+        <w:t>SOTTR</w:t>
       </w:r>
       <w:r>
         <w:rPr>
@@ -86,7 +72,7 @@
           <w:iCs/>
           <w:szCs w:val="26"/>
         </w:rPr>
-        <w:t xml:space="preserve"> {{DAY}} </w:t>
+        <w:t xml:space="preserve"> DAY </w:t>
       </w:r>
       <w:r>
         <w:rPr>
@@ -107,7 +93,7 @@
           <w:iCs/>
           <w:szCs w:val="26"/>
         </w:rPr>
-        <w:t>{{MONTH}}</w:t>
+        <w:t>MONTH</w:t>
       </w:r>
       <w:r>
         <w:rPr>
@@ -128,7 +114,7 @@
           <w:iCs/>
           <w:szCs w:val="26"/>
         </w:rPr>
-        <w:t>{{YEAR}}</w:t>
+        <w:t>YEAR</w:t>
       </w:r>
     </w:p>
     <w:p>
@@ -341,7 +327,7 @@
                 <w:sz w:val="28"/>
                 <w:szCs w:val="28"/>
               </w:rPr>
-              <w:t>{{DUAN}}</w:t>
+              <w:t>DUAN</w:t>
             </w:r>
           </w:p>
         </w:tc>
@@ -426,7 +412,7 @@
                 <w:sz w:val="28"/>
                 <w:szCs w:val="28"/>
               </w:rPr>
-              <w:t>{{CONGTRINH}}</w:t>
+              <w:t>CONGTRINH</w:t>
             </w:r>
           </w:p>
         </w:tc>
@@ -510,7 +496,7 @@
                 <w:sz w:val="28"/>
                 <w:szCs w:val="28"/>
               </w:rPr>
-              <w:t>{{HANGMUC}}</w:t>
+              <w:t>HANGMUC</w:t>
             </w:r>
           </w:p>
         </w:tc>
@@ -595,7 +581,7 @@
                 <w:sz w:val="28"/>
                 <w:szCs w:val="28"/>
               </w:rPr>
-              <w:t>{{DIADIEM}}</w:t>
+              <w:t>DIADIEM</w:t>
             </w:r>
           </w:p>
         </w:tc>
@@ -705,7 +691,23 @@
           <w:sz w:val="28"/>
           <w:szCs w:val="28"/>
         </w:rPr>
-        <w:t>Căn cứ nhu cầu đặt trạm phát sóng di động của Công ty Cổ phần ETELCOM và khả năng đáp ứng của Công ty Cổ phần Phát triển Hạ tầng kỹ thuật Becamex - Bình Phước;</w:t>
+        <w:t xml:space="preserve">Căn cứ nhu cầu đặt trạm phát sóng di động của </w:t>
+      </w:r>
+      <w:r>
+        <w:rPr>
+          <w:color w:val="0D0D0D" w:themeColor="text1" w:themeTint="F2"/>
+          <w:sz w:val="28"/>
+          <w:szCs w:val="28"/>
+        </w:rPr>
+        <w:t>NHACUNGCAP</w:t>
+      </w:r>
+      <w:r>
+        <w:rPr>
+          <w:color w:val="0D0D0D" w:themeColor="text1" w:themeTint="F2"/>
+          <w:sz w:val="28"/>
+          <w:szCs w:val="28"/>
+        </w:rPr>
+        <w:t xml:space="preserve"> và khả năng đáp ứng của Công ty Cổ phần Phát triển Hạ tầng kỹ thuật Becamex - Bình Phước;</w:t>
       </w:r>
     </w:p>
     <w:p>
@@ -770,7 +772,7 @@
           <w:sz w:val="28"/>
           <w:szCs w:val="28"/>
         </w:rPr>
-        <w:t>Công ty Cổ phần ETELCOM</w:t>
+        <w:t>NHACUNGCAP</w:t>
       </w:r>
       <w:r>
         <w:rPr>
@@ -945,7 +947,7 @@
           <w:sz w:val="28"/>
           <w:szCs w:val="28"/>
         </w:rPr>
-        <w:t xml:space="preserve">ký Biên bản thỏa thuận </w:t>
+        <w:t>ký Biên bản thỏa thuận</w:t>
       </w:r>
       <w:r>
         <w:rPr>
@@ -953,7 +955,7 @@
           <w:sz w:val="28"/>
           <w:szCs w:val="28"/>
         </w:rPr>
-        <w:t>{{HANGMUC}}</w:t>
+        <w:t xml:space="preserve"> đặt</w:t>
       </w:r>
       <w:r>
         <w:rPr>
@@ -969,6 +971,22 @@
           <w:sz w:val="28"/>
           <w:szCs w:val="28"/>
         </w:rPr>
+        <w:t>HANGMUC</w:t>
+      </w:r>
+      <w:r>
+        <w:rPr>
+          <w:bCs/>
+          <w:sz w:val="28"/>
+          <w:szCs w:val="28"/>
+        </w:rPr>
+        <w:t xml:space="preserve"> </w:t>
+      </w:r>
+      <w:r>
+        <w:rPr>
+          <w:bCs/>
+          <w:sz w:val="28"/>
+          <w:szCs w:val="28"/>
+        </w:rPr>
         <w:t xml:space="preserve">tại </w:t>
       </w:r>
       <w:r>
@@ -993,7 +1011,7 @@
           <w:sz w:val="28"/>
           <w:szCs w:val="28"/>
         </w:rPr>
-        <w:t>{{CONGTRINH}}</w:t>
+        <w:t>CONGTRINH</w:t>
       </w:r>
       <w:r>
         <w:rPr>
@@ -1009,7 +1027,7 @@
           <w:sz w:val="28"/>
           <w:szCs w:val="28"/>
         </w:rPr>
-        <w:t>{{DUAN}}</w:t>
+        <w:t>DUAN</w:t>
       </w:r>
       <w:r>
         <w:rPr>
@@ -1017,9 +1035,17 @@
           <w:sz w:val="28"/>
           <w:szCs w:val="28"/>
         </w:rPr>
-        <w:t xml:space="preserve"> với Công ty Cổ phần ETELCOM</w:t>
+        <w:t xml:space="preserve"> với </w:t>
       </w:r>
       <w:bookmarkEnd w:id="4"/>
+      <w:r>
+        <w:rPr>
+          <w:bCs/>
+          <w:sz w:val="28"/>
+          <w:szCs w:val="28"/>
+        </w:rPr>
+        <w:t>NHACUNGCAP</w:t>
+      </w:r>
       <w:r>
         <w:rPr>
           <w:bCs/>
@@ -1106,50 +1132,14 @@
         </w:rPr>
         <w:t xml:space="preserve">: </w:t>
       </w:r>
-      <w:bookmarkStart w:id="6" w:name="_Hlk216879084"/>
       <w:r>
         <w:rPr>
           <w:b/>
           <w:sz w:val="28"/>
           <w:szCs w:val="28"/>
         </w:rPr>
-        <w:t>C</w:t>
+        <w:t>NHACUNGCAP</w:t>
       </w:r>
-      <w:r>
-        <w:rPr>
-          <w:b/>
-          <w:sz w:val="28"/>
-          <w:szCs w:val="28"/>
-          <w:lang w:val="vi-VN"/>
-        </w:rPr>
-        <w:t xml:space="preserve">ông ty </w:t>
-      </w:r>
-      <w:r>
-        <w:rPr>
-          <w:b/>
-          <w:sz w:val="28"/>
-          <w:szCs w:val="28"/>
-        </w:rPr>
-        <w:t>C</w:t>
-      </w:r>
-      <w:r>
-        <w:rPr>
-          <w:b/>
-          <w:sz w:val="28"/>
-          <w:szCs w:val="28"/>
-          <w:lang w:val="vi-VN"/>
-        </w:rPr>
-        <w:t xml:space="preserve">ổ phần </w:t>
-      </w:r>
-      <w:r>
-        <w:rPr>
-          <w:b/>
-          <w:sz w:val="28"/>
-          <w:szCs w:val="28"/>
-        </w:rPr>
-        <w:t>ETELCOM</w:t>
-      </w:r>
-      <w:bookmarkEnd w:id="6"/>
     </w:p>
     <w:tbl>
       <w:tblPr>
@@ -1184,7 +1174,7 @@
                 <w:lang w:val="sv-SE"/>
               </w:rPr>
             </w:pPr>
-            <w:bookmarkStart w:id="7" w:name="_Hlk216879131"/>
+            <w:bookmarkStart w:id="6" w:name="_Hlk216879131"/>
             <w:r>
               <w:rPr>
                 <w:i/>
@@ -1245,7 +1235,7 @@
                 <w:szCs w:val="28"/>
                 <w:lang w:val="vi-VN"/>
               </w:rPr>
-              <w:t>Số 10, đường D, KDC Chánh Nghĩa, phường Thủ Dầu Một, thành phố Hồ Chí Minh</w:t>
+              <w:t>DIACHI</w:t>
             </w:r>
           </w:p>
         </w:tc>
@@ -1329,7 +1319,7 @@
                 <w:sz w:val="28"/>
                 <w:szCs w:val="28"/>
               </w:rPr>
-              <w:t>0908.516.789</w:t>
+              <w:t>SDT</w:t>
             </w:r>
           </w:p>
         </w:tc>
@@ -1413,7 +1403,7 @@
                 <w:sz w:val="28"/>
                 <w:szCs w:val="28"/>
               </w:rPr>
-              <w:t>etelcom.jsc@gmail.com</w:t>
+              <w:t>EMAIL</w:t>
             </w:r>
           </w:p>
         </w:tc>
@@ -1492,21 +1482,11 @@
             </w:pPr>
             <w:r>
               <w:rPr>
-                <w:b/>
-                <w:bCs/>
                 <w:color w:val="0D0D0D" w:themeColor="text1" w:themeTint="F2"/>
                 <w:sz w:val="28"/>
                 <w:szCs w:val="28"/>
               </w:rPr>
-              <w:t>8600.376.789</w:t>
-            </w:r>
-            <w:r>
-              <w:rPr>
-                <w:color w:val="0D0D0D" w:themeColor="text1" w:themeTint="F2"/>
-                <w:sz w:val="28"/>
-                <w:szCs w:val="28"/>
-              </w:rPr>
-              <w:t xml:space="preserve"> tại ngân hàng BIDV Chi nhánh Nam Bình Dương</w:t>
+              <w:t>STK1</w:t>
             </w:r>
           </w:p>
         </w:tc>
@@ -1540,7 +1520,6 @@
                 <w:szCs w:val="28"/>
                 <w:lang w:val="sv-SE"/>
               </w:rPr>
-              <w:lastRenderedPageBreak/>
               <w:t>Mã số thuế</w:t>
             </w:r>
           </w:p>
@@ -1580,8 +1559,6 @@
           <w:p>
             <w:pPr>
               <w:rPr>
-                <w:b/>
-                <w:bCs/>
                 <w:color w:val="0D0D0D" w:themeColor="text1" w:themeTint="F2"/>
                 <w:sz w:val="28"/>
                 <w:szCs w:val="28"/>
@@ -1590,13 +1567,12 @@
             </w:pPr>
             <w:r>
               <w:rPr>
-                <w:b/>
-                <w:bCs/>
-                <w:spacing w:val="80"/>
-                <w:sz w:val="28"/>
-                <w:szCs w:val="28"/>
-              </w:rPr>
-              <w:t>3703198694</w:t>
+                <w:color w:val="0D0D0D" w:themeColor="text1" w:themeTint="F2"/>
+                <w:sz w:val="28"/>
+                <w:szCs w:val="28"/>
+                <w:shd w:val="clear" w:color="auto" w:fill="FFFFFF"/>
+              </w:rPr>
+              <w:t>MST</w:t>
             </w:r>
           </w:p>
         </w:tc>
@@ -1673,8 +1649,6 @@
             <w:pPr>
               <w:spacing w:after="120"/>
               <w:rPr>
-                <w:b/>
-                <w:bCs/>
                 <w:color w:val="0D0D0D" w:themeColor="text1" w:themeTint="F2"/>
                 <w:sz w:val="28"/>
                 <w:szCs w:val="28"/>
@@ -1687,17 +1661,7 @@
                 <w:sz w:val="28"/>
                 <w:szCs w:val="28"/>
               </w:rPr>
-              <w:t xml:space="preserve">Ông </w:t>
-            </w:r>
-            <w:r>
-              <w:rPr>
-                <w:b/>
-                <w:bCs/>
-                <w:color w:val="0D0D0D" w:themeColor="text1" w:themeTint="F2"/>
-                <w:sz w:val="28"/>
-                <w:szCs w:val="28"/>
-              </w:rPr>
-              <w:t>Nguyễn Doãn Cường</w:t>
+              <w:t>DAIDIEN</w:t>
             </w:r>
           </w:p>
         </w:tc>
@@ -1710,8 +1674,6 @@
             <w:pPr>
               <w:spacing w:after="120"/>
               <w:rPr>
-                <w:b/>
-                <w:bCs/>
                 <w:color w:val="0D0D0D" w:themeColor="text1" w:themeTint="F2"/>
                 <w:sz w:val="28"/>
                 <w:szCs w:val="28"/>
@@ -1738,14 +1700,12 @@
             </w:r>
             <w:r>
               <w:rPr>
-                <w:b/>
-                <w:bCs/>
                 <w:color w:val="0D0D0D" w:themeColor="text1" w:themeTint="F2"/>
                 <w:sz w:val="28"/>
                 <w:szCs w:val="28"/>
                 <w:lang w:val="vi-VN"/>
               </w:rPr>
-              <w:t>Tổng Giám đốc</w:t>
+              <w:t>CHUCVU</w:t>
             </w:r>
           </w:p>
         </w:tc>
@@ -1771,9 +1731,9 @@
           <w:szCs w:val="28"/>
         </w:rPr>
       </w:pPr>
-      <w:bookmarkStart w:id="8" w:name="_Hlk216879155"/>
+      <w:bookmarkStart w:id="7" w:name="_Hlk216879155"/>
       <w:bookmarkEnd w:id="5"/>
-      <w:bookmarkEnd w:id="7"/>
+      <w:bookmarkEnd w:id="6"/>
       <w:r>
         <w:rPr>
           <w:b/>
@@ -1782,7 +1742,7 @@
         </w:rPr>
         <w:t>Nội dung trình ký</w:t>
       </w:r>
-      <w:bookmarkEnd w:id="8"/>
+      <w:bookmarkEnd w:id="7"/>
       <w:r>
         <w:rPr>
           <w:b/>
@@ -1818,6 +1778,7 @@
           <w:sz w:val="28"/>
           <w:szCs w:val="28"/>
         </w:rPr>
+        <w:lastRenderedPageBreak/>
         <w:t xml:space="preserve">  Nội dung</w:t>
       </w:r>
       <w:r>
@@ -1845,14 +1806,14 @@
           <w:szCs w:val="28"/>
         </w:rPr>
       </w:pPr>
-      <w:bookmarkStart w:id="9" w:name="_Hlk216879575"/>
+      <w:bookmarkStart w:id="8" w:name="_Hlk216879575"/>
       <w:r>
         <w:rPr>
           <w:bCs/>
           <w:sz w:val="28"/>
           <w:szCs w:val="28"/>
         </w:rPr>
-        <w:t xml:space="preserve">Bên A đồng ý cho Bên B đặt trạm phát sóng di động - </w:t>
+        <w:t xml:space="preserve">Bên A đồng ý cho Bên B đặt trạm phát sóng di động </w:t>
       </w:r>
       <w:r>
         <w:rPr>
@@ -1860,7 +1821,7 @@
           <w:sz w:val="28"/>
           <w:szCs w:val="28"/>
         </w:rPr>
-        <w:t>{{MATRAM}}</w:t>
+        <w:t>HANGMUC</w:t>
       </w:r>
       <w:r>
         <w:rPr>
@@ -1886,7 +1847,7 @@
         </w:rPr>
         <w:t>như sau</w:t>
       </w:r>
-      <w:bookmarkEnd w:id="9"/>
+      <w:bookmarkEnd w:id="8"/>
       <w:r>
         <w:rPr>
           <w:bCs/>
@@ -2005,7 +1966,7 @@
                 <w:sz w:val="28"/>
                 <w:szCs w:val="28"/>
               </w:rPr>
-              <w:t>{{MATRAM}}</w:t>
+              <w:t>HANGMUC</w:t>
             </w:r>
           </w:p>
         </w:tc>
@@ -2094,6 +2055,7 @@
               <w:rPr>
                 <w:sz w:val="28"/>
                 <w:szCs w:val="28"/>
+                <w:lang w:val="en-US"/>
               </w:rPr>
             </w:pPr>
             <w:r>
@@ -2101,7 +2063,7 @@
                 <w:sz w:val="28"/>
                 <w:szCs w:val="28"/>
               </w:rPr>
-              <w:t>{{DUAN}}</w:t>
+              <w:t>DUAN</w:t>
             </w:r>
           </w:p>
         </w:tc>
@@ -2190,6 +2152,7 @@
               <w:rPr>
                 <w:sz w:val="28"/>
                 <w:szCs w:val="28"/>
+                <w:lang w:val="en-US"/>
               </w:rPr>
             </w:pPr>
             <w:r>
@@ -2197,7 +2160,7 @@
                 <w:sz w:val="28"/>
                 <w:szCs w:val="28"/>
               </w:rPr>
-              <w:t>{{CONGTRINH}}</w:t>
+              <w:t>CONGTRINH</w:t>
             </w:r>
           </w:p>
         </w:tc>
@@ -2286,6 +2249,7 @@
               <w:rPr>
                 <w:sz w:val="28"/>
                 <w:szCs w:val="28"/>
+                <w:lang w:val="en-US"/>
               </w:rPr>
             </w:pPr>
             <w:r>
@@ -2293,7 +2257,7 @@
                 <w:sz w:val="28"/>
                 <w:szCs w:val="28"/>
               </w:rPr>
-              <w:t>{{L1</w:t>
+              <w:t>L1</w:t>
             </w:r>
             <w:r>
               <w:rPr>
@@ -2302,13 +2266,6 @@
                 <w:lang w:val="en-US"/>
               </w:rPr>
               <w:t>2</w:t>
-            </w:r>
-            <w:r>
-              <w:rPr>
-                <w:sz w:val="28"/>
-                <w:szCs w:val="28"/>
-              </w:rPr>
-              <w:t>}}</w:t>
             </w:r>
           </w:p>
         </w:tc>
@@ -2326,33 +2283,19 @@
                 <w:tab w:val="left" w:leader="underscore" w:pos="8904"/>
               </w:tabs>
               <w:spacing w:before="60" w:after="60" w:line="276" w:lineRule="auto"/>
-              <w:jc w:val="center"/>
-              <w:rPr>
-                <w:sz w:val="28"/>
-                <w:szCs w:val="28"/>
+              <w:rPr>
+                <w:sz w:val="28"/>
+                <w:szCs w:val="28"/>
+                <w:lang w:val="en-US"/>
               </w:rPr>
             </w:pPr>
             <w:r>
               <w:rPr>
                 <w:sz w:val="28"/>
                 <w:szCs w:val="28"/>
-              </w:rPr>
-              <w:t>{{L1</w:t>
-            </w:r>
-            <w:r>
-              <w:rPr>
-                <w:sz w:val="28"/>
-                <w:szCs w:val="28"/>
                 <w:lang w:val="en-US"/>
               </w:rPr>
-              <w:t>1</w:t>
-            </w:r>
-            <w:r>
-              <w:rPr>
-                <w:sz w:val="28"/>
-                <w:szCs w:val="28"/>
-              </w:rPr>
-              <w:t>}}</w:t>
+              <w:t>L11</w:t>
             </w:r>
           </w:p>
         </w:tc>
@@ -2441,7 +2384,7 @@
                 <w:sz w:val="28"/>
                 <w:szCs w:val="28"/>
               </w:rPr>
-              <w:t>{{L2</w:t>
+              <w:t>L2</w:t>
             </w:r>
             <w:r>
               <w:rPr>
@@ -2450,13 +2393,6 @@
                 <w:lang w:val="en-US"/>
               </w:rPr>
               <w:t>2</w:t>
-            </w:r>
-            <w:r>
-              <w:rPr>
-                <w:sz w:val="28"/>
-                <w:szCs w:val="28"/>
-              </w:rPr>
-              <w:t>}}</w:t>
             </w:r>
           </w:p>
         </w:tc>
@@ -2478,6 +2414,7 @@
               <w:rPr>
                 <w:sz w:val="28"/>
                 <w:szCs w:val="28"/>
+                <w:lang w:val="en-US"/>
               </w:rPr>
             </w:pPr>
             <w:r>
@@ -2485,7 +2422,7 @@
                 <w:sz w:val="28"/>
                 <w:szCs w:val="28"/>
               </w:rPr>
-              <w:t>{{L2</w:t>
+              <w:t>L2</w:t>
             </w:r>
             <w:r>
               <w:rPr>
@@ -2494,13 +2431,6 @@
                 <w:lang w:val="en-US"/>
               </w:rPr>
               <w:t>1</w:t>
-            </w:r>
-            <w:r>
-              <w:rPr>
-                <w:sz w:val="28"/>
-                <w:szCs w:val="28"/>
-              </w:rPr>
-              <w:t>}}</w:t>
             </w:r>
           </w:p>
         </w:tc>
@@ -2581,6 +2511,7 @@
               <w:rPr>
                 <w:sz w:val="28"/>
                 <w:szCs w:val="28"/>
+                <w:lang w:val="en-US"/>
               </w:rPr>
             </w:pPr>
             <w:r>
@@ -2588,7 +2519,7 @@
                 <w:sz w:val="28"/>
                 <w:szCs w:val="28"/>
               </w:rPr>
-              <w:t>{{L3</w:t>
+              <w:t>L3</w:t>
             </w:r>
             <w:r>
               <w:rPr>
@@ -2597,13 +2528,6 @@
                 <w:lang w:val="en-US"/>
               </w:rPr>
               <w:t>2</w:t>
-            </w:r>
-            <w:r>
-              <w:rPr>
-                <w:sz w:val="28"/>
-                <w:szCs w:val="28"/>
-              </w:rPr>
-              <w:t>}}</w:t>
             </w:r>
           </w:p>
         </w:tc>
@@ -2625,6 +2549,7 @@
               <w:rPr>
                 <w:sz w:val="28"/>
                 <w:szCs w:val="28"/>
+                <w:lang w:val="en-US"/>
               </w:rPr>
             </w:pPr>
             <w:r>
@@ -2632,7 +2557,7 @@
                 <w:sz w:val="28"/>
                 <w:szCs w:val="28"/>
               </w:rPr>
-              <w:t>{{L3</w:t>
+              <w:t>L3</w:t>
             </w:r>
             <w:r>
               <w:rPr>
@@ -2641,13 +2566,6 @@
                 <w:lang w:val="en-US"/>
               </w:rPr>
               <w:t>1</w:t>
-            </w:r>
-            <w:r>
-              <w:rPr>
-                <w:sz w:val="28"/>
-                <w:szCs w:val="28"/>
-              </w:rPr>
-              <w:t>}}</w:t>
             </w:r>
           </w:p>
         </w:tc>
@@ -2728,6 +2646,7 @@
               <w:rPr>
                 <w:sz w:val="28"/>
                 <w:szCs w:val="28"/>
+                <w:lang w:val="en-US"/>
               </w:rPr>
             </w:pPr>
             <w:r>
@@ -2735,7 +2654,7 @@
                 <w:sz w:val="28"/>
                 <w:szCs w:val="28"/>
               </w:rPr>
-              <w:t>{{L4</w:t>
+              <w:t>L4</w:t>
             </w:r>
             <w:r>
               <w:rPr>
@@ -2744,13 +2663,6 @@
                 <w:lang w:val="en-US"/>
               </w:rPr>
               <w:t>2</w:t>
-            </w:r>
-            <w:r>
-              <w:rPr>
-                <w:sz w:val="28"/>
-                <w:szCs w:val="28"/>
-              </w:rPr>
-              <w:t>}}</w:t>
             </w:r>
           </w:p>
         </w:tc>
@@ -2772,6 +2684,7 @@
               <w:rPr>
                 <w:sz w:val="28"/>
                 <w:szCs w:val="28"/>
+                <w:lang w:val="en-US"/>
               </w:rPr>
             </w:pPr>
             <w:r>
@@ -2779,7 +2692,7 @@
                 <w:sz w:val="28"/>
                 <w:szCs w:val="28"/>
               </w:rPr>
-              <w:t>{{L4</w:t>
+              <w:t>L4</w:t>
             </w:r>
             <w:r>
               <w:rPr>
@@ -2788,13 +2701,6 @@
                 <w:lang w:val="en-US"/>
               </w:rPr>
               <w:t>1</w:t>
-            </w:r>
-            <w:r>
-              <w:rPr>
-                <w:sz w:val="28"/>
-                <w:szCs w:val="28"/>
-              </w:rPr>
-              <w:t>}}</w:t>
             </w:r>
           </w:p>
         </w:tc>
@@ -3477,7 +3383,6 @@
           <w:sz w:val="28"/>
           <w:szCs w:val="28"/>
         </w:rPr>
-        <w:lastRenderedPageBreak/>
         <w:t xml:space="preserve">Kính trình </w:t>
       </w:r>
       <w:r>
@@ -3579,7 +3484,7 @@
                 <w:lang w:eastAsia="ko-KR"/>
               </w:rPr>
             </w:pPr>
-            <w:bookmarkStart w:id="10" w:name="_Hlk208818503"/>
+            <w:bookmarkStart w:id="9" w:name="_Hlk208818503"/>
             <w:r>
               <w:rPr>
                 <w:b/>
@@ -4187,7 +4092,7 @@
           </w:p>
         </w:tc>
       </w:tr>
-      <w:bookmarkEnd w:id="10"/>
+      <w:bookmarkEnd w:id="9"/>
     </w:tbl>
     <w:p>
       <w:pPr>
@@ -4635,7 +4540,7 @@
           <w:r>
             <w:t xml:space="preserve"> </w:t>
           </w:r>
-          <w:bookmarkStart w:id="11" w:name="_Hlk216878783"/>
+          <w:bookmarkStart w:id="10" w:name="_Hlk216878783"/>
           <w:r>
             <w:rPr>
               <w:i/>
@@ -4651,8 +4556,35 @@
               <w:color w:val="000000" w:themeColor="text1"/>
               <w:sz w:val="26"/>
               <w:szCs w:val="26"/>
+              <w:lang w:val="en-US"/>
             </w:rPr>
-            <w:t>{{HANGMUC}}</w:t>
+            <w:t>đặt</w:t>
+          </w:r>
+          <w:r>
+            <w:rPr>
+              <w:i/>
+              <w:color w:val="000000" w:themeColor="text1"/>
+              <w:sz w:val="26"/>
+              <w:szCs w:val="26"/>
+              <w:lang w:val="en-US"/>
+            </w:rPr>
+            <w:t xml:space="preserve"> </w:t>
+          </w:r>
+          <w:r>
+            <w:t xml:space="preserve"> </w:t>
+          </w:r>
+          <w:r>
+            <w:t xml:space="preserve"> </w:t>
+          </w:r>
+          <w:r>
+            <w:rPr>
+              <w:i/>
+              <w:color w:val="000000" w:themeColor="text1"/>
+              <w:sz w:val="26"/>
+              <w:szCs w:val="26"/>
+              <w:lang w:val="en-US"/>
+            </w:rPr>
+            <w:t>HANGMUC</w:t>
           </w:r>
           <w:r>
             <w:rPr>
@@ -4670,8 +4602,19 @@
               <w:color w:val="000000" w:themeColor="text1"/>
               <w:sz w:val="26"/>
               <w:szCs w:val="26"/>
+              <w:lang w:val="en-US"/>
             </w:rPr>
-            <w:t xml:space="preserve">tại </w:t>
+            <w:t xml:space="preserve"> </w:t>
+          </w:r>
+          <w:r>
+            <w:rPr>
+              <w:i/>
+              <w:color w:val="000000" w:themeColor="text1"/>
+              <w:sz w:val="26"/>
+              <w:szCs w:val="26"/>
+              <w:lang w:val="en-US"/>
+            </w:rPr>
+            <w:t xml:space="preserve"> t</w:t>
           </w:r>
           <w:r>
             <w:rPr>
@@ -4680,7 +4623,7 @@
               <w:sz w:val="26"/>
               <w:szCs w:val="26"/>
             </w:rPr>
-            <w:t>{{CONGTRINH}}</w:t>
+            <w:t xml:space="preserve">ại </w:t>
           </w:r>
           <w:r>
             <w:rPr>
@@ -4689,9 +4632,39 @@
               <w:sz w:val="26"/>
               <w:szCs w:val="26"/>
             </w:rPr>
-            <w:t xml:space="preserve"> với Công ty Cổ phần ETELCOM</w:t>
+            <w:t>CONGTRINH</w:t>
           </w:r>
-          <w:bookmarkEnd w:id="11"/>
+          <w:r>
+            <w:rPr>
+              <w:i/>
+              <w:color w:val="000000" w:themeColor="text1"/>
+              <w:sz w:val="26"/>
+              <w:szCs w:val="26"/>
+            </w:rPr>
+            <w:t xml:space="preserve"> với</w:t>
+          </w:r>
+          <w:r>
+            <w:t xml:space="preserve"> </w:t>
+          </w:r>
+          <w:r>
+            <w:rPr>
+              <w:i/>
+              <w:color w:val="000000" w:themeColor="text1"/>
+              <w:sz w:val="26"/>
+              <w:szCs w:val="26"/>
+            </w:rPr>
+            <w:t>NHACUNGCAP</w:t>
+          </w:r>
+          <w:bookmarkEnd w:id="10"/>
+          <w:r>
+            <w:rPr>
+              <w:i/>
+              <w:color w:val="000000" w:themeColor="text1"/>
+              <w:sz w:val="26"/>
+              <w:szCs w:val="26"/>
+            </w:rPr>
+            <w:t xml:space="preserve"> </w:t>
+          </w:r>
           <w:r>
             <w:rPr>
               <w:i/>
@@ -9968,6 +9941,25 @@
 </file>
 
 <file path=customXml/item1.xml><?xml version="1.0" encoding="utf-8"?>
+<?mso-contentType ?>
+<FormTemplates xmlns="http://schemas.microsoft.com/sharepoint/v3/contenttype/forms">
+  <Display>DocumentLibraryForm</Display>
+  <Edit>DocumentLibraryForm</Edit>
+  <New>DocumentLibraryForm</New>
+</FormTemplates>
+</file>
+
+<file path=customXml/item2.xml><?xml version="1.0" encoding="utf-8"?>
+<b:Sources xmlns:b="http://schemas.openxmlformats.org/officeDocument/2006/bibliography" xmlns="http://schemas.openxmlformats.org/officeDocument/2006/bibliography" SelectedStyle="\APA.XSL" StyleName="APA"/>
+</file>
+
+<file path=customXml/item3.xml><?xml version="1.0" encoding="utf-8"?>
+<p:properties xmlns:p="http://schemas.microsoft.com/office/2006/metadata/properties" xmlns:xsi="http://www.w3.org/2001/XMLSchema-instance" xmlns:pc="http://schemas.microsoft.com/office/infopath/2007/PartnerControls">
+  <documentManagement/>
+</p:properties>
+</file>
+
+<file path=customXml/item4.xml><?xml version="1.0" encoding="utf-8"?>
 <ct:contentTypeSchema xmlns:ct="http://schemas.microsoft.com/office/2006/metadata/contentType" xmlns:ma="http://schemas.microsoft.com/office/2006/metadata/properties/metaAttributes" ct:_="" ma:_="" ma:contentTypeName="Document" ma:contentTypeID="0x010100805D4BEE55A24044BDE0D112F050CC83" ma:contentTypeVersion="1" ma:contentTypeDescription="Create a new document." ma:contentTypeScope="" ma:versionID="bfe3fb2b52072bba3ef6a4f234377cf8">
   <xsd:schema xmlns:xsd="http://www.w3.org/2001/XMLSchema" xmlns:xs="http://www.w3.org/2001/XMLSchema" xmlns:p="http://schemas.microsoft.com/office/2006/metadata/properties" targetNamespace="http://schemas.microsoft.com/office/2006/metadata/properties" ma:root="true" ma:fieldsID="3168da399c7eed0b2303d422f0440ed6">
     <xsd:element name="properties">
@@ -10081,26 +10073,32 @@
 </ct:contentTypeSchema>
 </file>
 
-<file path=customXml/item2.xml><?xml version="1.0" encoding="utf-8"?>
-<p:properties xmlns:p="http://schemas.microsoft.com/office/2006/metadata/properties" xmlns:xsi="http://www.w3.org/2001/XMLSchema-instance" xmlns:pc="http://schemas.microsoft.com/office/infopath/2007/PartnerControls">
-  <documentManagement/>
-</p:properties>
+<file path=customXml/itemProps1.xml><?xml version="1.0" encoding="utf-8"?>
+<ds:datastoreItem xmlns:ds="http://schemas.openxmlformats.org/officeDocument/2006/customXml" ds:itemID="{E2160846-F788-4AEA-B56E-7BF01218901D}">
+  <ds:schemaRefs>
+    <ds:schemaRef ds:uri="http://schemas.microsoft.com/sharepoint/v3/contenttype/forms"/>
+  </ds:schemaRefs>
+</ds:datastoreItem>
 </file>
 
-<file path=customXml/item3.xml><?xml version="1.0" encoding="utf-8"?>
-<b:Sources xmlns:b="http://schemas.openxmlformats.org/officeDocument/2006/bibliography" xmlns="http://schemas.openxmlformats.org/officeDocument/2006/bibliography" SelectedStyle="\APA.XSL" StyleName="APA"/>
+<file path=customXml/itemProps2.xml><?xml version="1.0" encoding="utf-8"?>
+<ds:datastoreItem xmlns:ds="http://schemas.openxmlformats.org/officeDocument/2006/customXml" ds:itemID="{9D0953AE-9A60-4325-AE9E-24D4E9F9FB75}">
+  <ds:schemaRefs>
+    <ds:schemaRef ds:uri="http://schemas.openxmlformats.org/officeDocument/2006/bibliography"/>
+  </ds:schemaRefs>
+</ds:datastoreItem>
 </file>
 
-<file path=customXml/item4.xml><?xml version="1.0" encoding="utf-8"?>
-<?mso-contentType ?>
-<FormTemplates xmlns="http://schemas.microsoft.com/sharepoint/v3/contenttype/forms">
-  <Display>DocumentLibraryForm</Display>
-  <Edit>DocumentLibraryForm</Edit>
-  <New>DocumentLibraryForm</New>
-</FormTemplates>
+<file path=customXml/itemProps3.xml><?xml version="1.0" encoding="utf-8"?>
+<ds:datastoreItem xmlns:ds="http://schemas.openxmlformats.org/officeDocument/2006/customXml" ds:itemID="{C4AF9458-447F-428E-8BFB-D288D293C150}">
+  <ds:schemaRefs>
+    <ds:schemaRef ds:uri="http://schemas.microsoft.com/office/2006/metadata/properties"/>
+    <ds:schemaRef ds:uri="http://schemas.microsoft.com/office/infopath/2007/PartnerControls"/>
+  </ds:schemaRefs>
+</ds:datastoreItem>
 </file>
 
-<file path=customXml/itemProps1.xml><?xml version="1.0" encoding="utf-8"?>
+<file path=customXml/itemProps4.xml><?xml version="1.0" encoding="utf-8"?>
 <ds:datastoreItem xmlns:ds="http://schemas.openxmlformats.org/officeDocument/2006/customXml" ds:itemID="{8E3BA125-43CC-44A9-9FCA-63E6975CACC6}">
   <ds:schemaRefs>
     <ds:schemaRef ds:uri="http://schemas.microsoft.com/office/2006/metadata/contentType"/>
@@ -10114,29 +10112,4 @@
     <ds:schemaRef ds:uri="http://schemas.microsoft.com/office/infopath/2007/PartnerControls"/>
   </ds:schemaRefs>
 </ds:datastoreItem>
-</file>
-
-<file path=customXml/itemProps2.xml><?xml version="1.0" encoding="utf-8"?>
-<ds:datastoreItem xmlns:ds="http://schemas.openxmlformats.org/officeDocument/2006/customXml" ds:itemID="{C4AF9458-447F-428E-8BFB-D288D293C150}">
-  <ds:schemaRefs>
-    <ds:schemaRef ds:uri="http://schemas.microsoft.com/office/2006/metadata/properties"/>
-    <ds:schemaRef ds:uri="http://schemas.microsoft.com/office/infopath/2007/PartnerControls"/>
-  </ds:schemaRefs>
-</ds:datastoreItem>
-</file>
-
-<file path=customXml/itemProps3.xml><?xml version="1.0" encoding="utf-8"?>
-<ds:datastoreItem xmlns:ds="http://schemas.openxmlformats.org/officeDocument/2006/customXml" ds:itemID="{9D0953AE-9A60-4325-AE9E-24D4E9F9FB75}">
-  <ds:schemaRefs>
-    <ds:schemaRef ds:uri="http://schemas.openxmlformats.org/officeDocument/2006/bibliography"/>
-  </ds:schemaRefs>
-</ds:datastoreItem>
-</file>
-
-<file path=customXml/itemProps4.xml><?xml version="1.0" encoding="utf-8"?>
-<ds:datastoreItem xmlns:ds="http://schemas.openxmlformats.org/officeDocument/2006/customXml" ds:itemID="{E2160846-F788-4AEA-B56E-7BF01218901D}">
-  <ds:schemaRefs>
-    <ds:schemaRef ds:uri="http://schemas.microsoft.com/sharepoint/v3/contenttype/forms"/>
-  </ds:schemaRefs>
-</ds:datastoreItem>
 </file>
</xml_diff>